<commit_message>
Aula 1203 - BACKEND - Termino API_CINEMA
</commit_message>
<xml_diff>
--- a/SENAI/WORDS/3º SEMESTRE/BACK-END/aula02_js_banco.docx
+++ b/SENAI/WORDS/3º SEMESTRE/BACK-END/aula02_js_banco.docx
@@ -21,9 +21,12 @@
           <w:sz w:val="32"/>
           <w:szCs w:val="32"/>
         </w:rPr>
-        <w:t xml:space="preserve">AULA </w:t>
-      </w:r>
-      <w:r>
+        <w:t>AULA 02</w:t>
+      </w:r>
+    </w:p>
+    <w:p>
+      <w:pPr>
+        <w:jc w:val="center"/>
         <w:rPr>
           <w:rFonts w:ascii="Arial" w:hAnsi="Arial"/>
           <w:b/>
@@ -31,12 +34,8 @@
           <w:sz w:val="32"/>
           <w:szCs w:val="32"/>
         </w:rPr>
-        <w:t>02</w:t>
-      </w:r>
-    </w:p>
-    <w:p>
-      <w:pPr>
-        <w:jc w:val="center"/>
+      </w:pPr>
+      <w:r>
         <w:rPr>
           <w:rFonts w:ascii="Arial" w:hAnsi="Arial"/>
           <w:b/>
@@ -44,8 +43,12 @@
           <w:sz w:val="32"/>
           <w:szCs w:val="32"/>
         </w:rPr>
-      </w:pPr>
-      <w:r>
+        <w:t>BACK-END</w:t>
+      </w:r>
+    </w:p>
+    <w:p>
+      <w:pPr>
+        <w:jc w:val="center"/>
         <w:rPr>
           <w:rFonts w:ascii="Arial" w:hAnsi="Arial"/>
           <w:b/>
@@ -53,12 +56,8 @@
           <w:sz w:val="32"/>
           <w:szCs w:val="32"/>
         </w:rPr>
-        <w:t>BACK-END</w:t>
-      </w:r>
-    </w:p>
-    <w:p>
-      <w:pPr>
-        <w:jc w:val="center"/>
+      </w:pPr>
+      <w:r>
         <w:rPr>
           <w:rFonts w:ascii="Arial" w:hAnsi="Arial"/>
           <w:b/>
@@ -66,8 +65,12 @@
           <w:sz w:val="32"/>
           <w:szCs w:val="32"/>
         </w:rPr>
-      </w:pPr>
-      <w:r>
+        <w:t>PERSISTÊNCIA DE DADOS</w:t>
+      </w:r>
+    </w:p>
+    <w:p>
+      <w:pPr>
+        <w:jc w:val="center"/>
         <w:rPr>
           <w:rFonts w:ascii="Arial" w:hAnsi="Arial"/>
           <w:b/>
@@ -75,12 +78,8 @@
           <w:sz w:val="32"/>
           <w:szCs w:val="32"/>
         </w:rPr>
-        <w:t>PERSISTÊNCIA DE DADOS</w:t>
-      </w:r>
-    </w:p>
-    <w:p>
-      <w:pPr>
-        <w:jc w:val="center"/>
+      </w:pPr>
+      <w:r>
         <w:rPr>
           <w:rFonts w:ascii="Arial" w:hAnsi="Arial"/>
           <w:b/>
@@ -88,8 +87,12 @@
           <w:sz w:val="32"/>
           <w:szCs w:val="32"/>
         </w:rPr>
-      </w:pPr>
-      <w:r>
+        <w:t>Node.js + MySQL</w:t>
+      </w:r>
+    </w:p>
+    <w:p>
+      <w:pPr>
+        <w:jc w:val="center"/>
         <w:rPr>
           <w:rFonts w:ascii="Arial" w:hAnsi="Arial"/>
           <w:b/>
@@ -97,19 +100,6 @@
           <w:sz w:val="32"/>
           <w:szCs w:val="32"/>
         </w:rPr>
-        <w:t>Node.js + MySQL</w:t>
-      </w:r>
-    </w:p>
-    <w:p>
-      <w:pPr>
-        <w:jc w:val="center"/>
-        <w:rPr>
-          <w:rFonts w:ascii="Arial" w:hAnsi="Arial"/>
-          <w:b/>
-          <w:bCs/>
-          <w:sz w:val="32"/>
-          <w:szCs w:val="32"/>
-        </w:rPr>
       </w:pPr>
     </w:p>
     <w:p>
@@ -175,41 +165,13 @@
           <w:szCs w:val="28"/>
         </w:rPr>
       </w:pPr>
-      <w:proofErr w:type="spellStart"/>
-      <w:r>
-        <w:rPr>
-          <w:rFonts w:ascii="Arial" w:hAnsi="Arial"/>
-          <w:sz w:val="28"/>
-          <w:szCs w:val="28"/>
-        </w:rPr>
-        <w:t>let</w:t>
-      </w:r>
-      <w:proofErr w:type="spellEnd"/>
-      <w:r>
-        <w:rPr>
-          <w:rFonts w:ascii="Arial" w:hAnsi="Arial"/>
-          <w:sz w:val="28"/>
-          <w:szCs w:val="28"/>
-        </w:rPr>
-        <w:t xml:space="preserve"> </w:t>
-      </w:r>
-      <w:proofErr w:type="spellStart"/>
-      <w:r>
-        <w:rPr>
-          <w:rFonts w:ascii="Arial" w:hAnsi="Arial"/>
-          <w:sz w:val="28"/>
-          <w:szCs w:val="28"/>
-        </w:rPr>
-        <w:t>usuarios</w:t>
-      </w:r>
-      <w:proofErr w:type="spellEnd"/>
-      <w:r>
-        <w:rPr>
-          <w:rFonts w:ascii="Arial" w:hAnsi="Arial"/>
-          <w:sz w:val="28"/>
-          <w:szCs w:val="28"/>
-        </w:rPr>
-        <w:t xml:space="preserve"> = []</w:t>
+      <w:r>
+        <w:rPr>
+          <w:rFonts w:ascii="Arial" w:hAnsi="Arial"/>
+          <w:sz w:val="28"/>
+          <w:szCs w:val="28"/>
+        </w:rPr>
+        <w:t>let usuarios = []</w:t>
       </w:r>
     </w:p>
     <w:p>
@@ -342,25 +304,7 @@
           <w:sz w:val="28"/>
           <w:szCs w:val="28"/>
         </w:rPr>
-        <w:t>Existem os bancos de dados relacionais (SQL), que serão utilizados por nós e os bancos de dados não relacionais (</w:t>
-      </w:r>
-      <w:proofErr w:type="spellStart"/>
-      <w:r>
-        <w:rPr>
-          <w:rFonts w:ascii="Arial" w:hAnsi="Arial"/>
-          <w:sz w:val="28"/>
-          <w:szCs w:val="28"/>
-        </w:rPr>
-        <w:t>NoSQL</w:t>
-      </w:r>
-      <w:proofErr w:type="spellEnd"/>
-      <w:r>
-        <w:rPr>
-          <w:rFonts w:ascii="Arial" w:hAnsi="Arial"/>
-          <w:sz w:val="28"/>
-          <w:szCs w:val="28"/>
-        </w:rPr>
-        <w:t>), que possuem maior flexibilidade e liberdade.</w:t>
+        <w:t>Existem os bancos de dados relacionais (SQL), que serão utilizados por nós e os bancos de dados não relacionais (NoSQL), que possuem maior flexibilidade e liberdade.</w:t>
       </w:r>
     </w:p>
     <w:p>
@@ -556,35 +500,7 @@
           <w:sz w:val="28"/>
           <w:szCs w:val="28"/>
         </w:rPr>
-        <w:t xml:space="preserve">Não é recomendado colocar credenciais (dados importantes) diretamente no código-fonte, isso oferece um enorme risco de segurança. Para isso, utilizamos um </w:t>
-      </w:r>
-      <w:proofErr w:type="gramStart"/>
-      <w:r>
-        <w:rPr>
-          <w:rFonts w:ascii="Arial" w:hAnsi="Arial"/>
-          <w:sz w:val="28"/>
-          <w:szCs w:val="28"/>
-        </w:rPr>
-        <w:t>arquivo .</w:t>
-      </w:r>
-      <w:proofErr w:type="spellStart"/>
-      <w:r>
-        <w:rPr>
-          <w:rFonts w:ascii="Arial" w:hAnsi="Arial"/>
-          <w:sz w:val="28"/>
-          <w:szCs w:val="28"/>
-        </w:rPr>
-        <w:t>env</w:t>
-      </w:r>
-      <w:proofErr w:type="spellEnd"/>
-      <w:proofErr w:type="gramEnd"/>
-      <w:r>
-        <w:rPr>
-          <w:rFonts w:ascii="Arial" w:hAnsi="Arial"/>
-          <w:sz w:val="28"/>
-          <w:szCs w:val="28"/>
-        </w:rPr>
-        <w:t xml:space="preserve"> que armazena essas informações.</w:t>
+        <w:t>Não é recomendado colocar credenciais (dados importantes) diretamente no código-fonte, isso oferece um enorme risco de segurança. Para isso, utilizamos um arquivo .env que armazena essas informações.</w:t>
       </w:r>
     </w:p>
     <w:p>
@@ -639,6 +555,7 @@
           <w:rFonts w:ascii="Arial" w:hAnsi="Arial"/>
           <w:b/>
           <w:bCs/>
+          <w:noProof/>
           <w:sz w:val="28"/>
           <w:szCs w:val="28"/>
         </w:rPr>
@@ -684,52 +601,23 @@
           <w:sz w:val="28"/>
           <w:szCs w:val="28"/>
         </w:rPr>
-        <w:t xml:space="preserve"> - </w:t>
-      </w:r>
-      <w:proofErr w:type="gramStart"/>
-      <w:r>
-        <w:rPr>
-          <w:rFonts w:ascii="Arial" w:hAnsi="Arial"/>
-          <w:sz w:val="28"/>
-          <w:szCs w:val="28"/>
-        </w:rPr>
-        <w:t>cria</w:t>
-      </w:r>
-      <w:proofErr w:type="gramEnd"/>
-      <w:r>
-        <w:rPr>
-          <w:rFonts w:ascii="Arial" w:hAnsi="Arial"/>
-          <w:sz w:val="28"/>
-          <w:szCs w:val="28"/>
-        </w:rPr>
-        <w:t xml:space="preserve"> o </w:t>
-      </w:r>
-      <w:proofErr w:type="spellStart"/>
-      <w:proofErr w:type="gramStart"/>
-      <w:r>
-        <w:rPr>
-          <w:rFonts w:ascii="Arial" w:hAnsi="Arial"/>
-          <w:sz w:val="28"/>
-          <w:szCs w:val="28"/>
-        </w:rPr>
-        <w:t>package.json</w:t>
-      </w:r>
-      <w:proofErr w:type="spellEnd"/>
-      <w:proofErr w:type="gramEnd"/>
-    </w:p>
-    <w:p>
-      <w:pPr>
-        <w:rPr>
-          <w:rFonts w:ascii="Arial" w:hAnsi="Arial"/>
-          <w:sz w:val="28"/>
-          <w:szCs w:val="28"/>
-        </w:rPr>
-      </w:pPr>
-      <w:r>
-        <w:rPr>
-          <w:rFonts w:ascii="Arial" w:hAnsi="Arial"/>
-          <w:b/>
-          <w:bCs/>
+        <w:t xml:space="preserve"> - cria o package.json</w:t>
+      </w:r>
+    </w:p>
+    <w:p>
+      <w:pPr>
+        <w:rPr>
+          <w:rFonts w:ascii="Arial" w:hAnsi="Arial"/>
+          <w:sz w:val="28"/>
+          <w:szCs w:val="28"/>
+        </w:rPr>
+      </w:pPr>
+      <w:r>
+        <w:rPr>
+          <w:rFonts w:ascii="Arial" w:hAnsi="Arial"/>
+          <w:b/>
+          <w:bCs/>
+          <w:noProof/>
           <w:sz w:val="28"/>
           <w:szCs w:val="28"/>
         </w:rPr>
@@ -785,85 +673,32 @@
           <w:sz w:val="28"/>
           <w:szCs w:val="28"/>
         </w:rPr>
-        <w:t xml:space="preserve">- </w:t>
-      </w:r>
-      <w:proofErr w:type="gramStart"/>
-      <w:r>
-        <w:rPr>
-          <w:rFonts w:ascii="Arial" w:hAnsi="Arial"/>
-          <w:sz w:val="28"/>
-          <w:szCs w:val="28"/>
-        </w:rPr>
-        <w:t>instala</w:t>
-      </w:r>
-      <w:proofErr w:type="gramEnd"/>
-      <w:r>
-        <w:rPr>
-          <w:rFonts w:ascii="Arial" w:hAnsi="Arial"/>
-          <w:sz w:val="28"/>
-          <w:szCs w:val="28"/>
-        </w:rPr>
-        <w:t xml:space="preserve"> o </w:t>
-      </w:r>
-      <w:proofErr w:type="spellStart"/>
-      <w:r>
-        <w:rPr>
-          <w:rFonts w:ascii="Arial" w:hAnsi="Arial"/>
-          <w:sz w:val="28"/>
-          <w:szCs w:val="28"/>
-        </w:rPr>
-        <w:t>node_modules</w:t>
-      </w:r>
-      <w:proofErr w:type="spellEnd"/>
-      <w:r>
-        <w:rPr>
-          <w:rFonts w:ascii="Arial" w:hAnsi="Arial"/>
-          <w:sz w:val="28"/>
-          <w:szCs w:val="28"/>
-        </w:rPr>
-        <w:t xml:space="preserve"> com as bibliotecas (</w:t>
-      </w:r>
-      <w:proofErr w:type="spellStart"/>
-      <w:r>
-        <w:rPr>
-          <w:rFonts w:ascii="Arial" w:hAnsi="Arial"/>
-          <w:sz w:val="28"/>
-          <w:szCs w:val="28"/>
-        </w:rPr>
-        <w:t>dotenv</w:t>
-      </w:r>
-      <w:proofErr w:type="spellEnd"/>
-      <w:r>
-        <w:rPr>
-          <w:rFonts w:ascii="Arial" w:hAnsi="Arial"/>
-          <w:sz w:val="28"/>
-          <w:szCs w:val="28"/>
-        </w:rPr>
-        <w:t xml:space="preserve"> é para as variáveis de ambiente)</w:t>
-      </w:r>
-    </w:p>
-    <w:p>
-      <w:pPr>
-        <w:rPr>
-          <w:rFonts w:ascii="Arial" w:hAnsi="Arial"/>
-          <w:sz w:val="28"/>
-          <w:szCs w:val="28"/>
-        </w:rPr>
-      </w:pPr>
-    </w:p>
-    <w:p>
-      <w:pPr>
-        <w:rPr>
-          <w:rFonts w:ascii="Arial" w:hAnsi="Arial"/>
-          <w:b/>
-          <w:bCs/>
-          <w:sz w:val="28"/>
-          <w:szCs w:val="28"/>
-        </w:rPr>
-      </w:pPr>
-      <w:r>
-        <w:rPr>
-          <w:rFonts w:ascii="Arial" w:hAnsi="Arial"/>
+        <w:t>- instala o node_modules com as bibliotecas (dotenv é para as variáveis de ambiente)</w:t>
+      </w:r>
+    </w:p>
+    <w:p>
+      <w:pPr>
+        <w:rPr>
+          <w:rFonts w:ascii="Arial" w:hAnsi="Arial"/>
+          <w:sz w:val="28"/>
+          <w:szCs w:val="28"/>
+        </w:rPr>
+      </w:pPr>
+    </w:p>
+    <w:p>
+      <w:pPr>
+        <w:rPr>
+          <w:rFonts w:ascii="Arial" w:hAnsi="Arial"/>
+          <w:b/>
+          <w:bCs/>
+          <w:sz w:val="28"/>
+          <w:szCs w:val="28"/>
+        </w:rPr>
+      </w:pPr>
+      <w:r>
+        <w:rPr>
+          <w:rFonts w:ascii="Arial" w:hAnsi="Arial"/>
+          <w:noProof/>
           <w:sz w:val="28"/>
           <w:szCs w:val="28"/>
         </w:rPr>
@@ -919,52 +754,41 @@
           <w:sz w:val="28"/>
           <w:szCs w:val="28"/>
         </w:rPr>
-        <w:t xml:space="preserve">Informações necessárias </w:t>
-      </w:r>
-      <w:proofErr w:type="gramStart"/>
-      <w:r>
-        <w:rPr>
-          <w:rFonts w:ascii="Arial" w:hAnsi="Arial"/>
-          <w:b/>
-          <w:bCs/>
-          <w:sz w:val="28"/>
-          <w:szCs w:val="28"/>
-        </w:rPr>
-        <w:t>no .</w:t>
-      </w:r>
-      <w:proofErr w:type="spellStart"/>
-      <w:r>
-        <w:rPr>
-          <w:rFonts w:ascii="Arial" w:hAnsi="Arial"/>
-          <w:b/>
-          <w:bCs/>
-          <w:sz w:val="28"/>
-          <w:szCs w:val="28"/>
-        </w:rPr>
-        <w:t>env</w:t>
-      </w:r>
-      <w:proofErr w:type="spellEnd"/>
-      <w:proofErr w:type="gramEnd"/>
-    </w:p>
-    <w:p>
-      <w:pPr>
-        <w:rPr>
-          <w:rFonts w:ascii="Arial" w:hAnsi="Arial"/>
-          <w:b/>
-          <w:bCs/>
-          <w:sz w:val="28"/>
-          <w:szCs w:val="28"/>
-        </w:rPr>
-      </w:pPr>
-    </w:p>
-    <w:p>
-      <w:pPr>
-        <w:rPr>
-          <w:rFonts w:ascii="Arial" w:hAnsi="Arial"/>
-          <w:sz w:val="28"/>
-          <w:szCs w:val="28"/>
-        </w:rPr>
-      </w:pPr>
+        <w:t>Informações necessárias no .env</w:t>
+      </w:r>
+    </w:p>
+    <w:p>
+      <w:pPr>
+        <w:rPr>
+          <w:rFonts w:ascii="Arial" w:hAnsi="Arial"/>
+          <w:b/>
+          <w:bCs/>
+          <w:sz w:val="28"/>
+          <w:szCs w:val="28"/>
+        </w:rPr>
+      </w:pPr>
+    </w:p>
+    <w:p>
+      <w:pPr>
+        <w:rPr>
+          <w:rFonts w:ascii="Arial" w:hAnsi="Arial"/>
+          <w:b/>
+          <w:bCs/>
+          <w:sz w:val="32"/>
+          <w:szCs w:val="32"/>
+        </w:rPr>
+      </w:pPr>
+      <w:r>
+        <w:rPr>
+          <w:rFonts w:ascii="Arial" w:hAnsi="Arial"/>
+          <w:b/>
+          <w:bCs/>
+          <w:sz w:val="32"/>
+          <w:szCs w:val="32"/>
+        </w:rPr>
+        <w:lastRenderedPageBreak/>
+        <w:t>APLICAÇÃO E EXEMPLOS NA api_cinema (EXER_SEM_NOTA – BACK-END)</w:t>
+      </w:r>
     </w:p>
     <w:sectPr>
       <w:pgSz w:w="11906" w:h="16838"/>
@@ -1580,6 +1404,7 @@
   <w:style w:type="character" w:default="1" w:styleId="Fontepargpadro">
     <w:name w:val="Default Paragraph Font"/>
     <w:uiPriority w:val="1"/>
+    <w:semiHidden/>
     <w:unhideWhenUsed/>
   </w:style>
   <w:style w:type="table" w:default="1" w:styleId="Tabelanormal">

</xml_diff>